<commit_message>
Atualização do readme 01/04
</commit_message>
<xml_diff>
--- a/Documents and Backups/Documentacao ViT.docx
+++ b/Documents and Backups/Documentacao ViT.docx
@@ -1407,7 +1407,35 @@
           <w:b/>
           <w:bCs/>
         </w:rPr>
-        <w:t>EXPERIMENTO 1 (VIT) – VALIDAÇÃO DA ARQUITETURA</w:t>
+        <w:t>EXPERIMENTO</w:t>
+      </w:r>
+      <w:r>
+        <w:rPr>
+          <w:b/>
+          <w:bCs/>
+        </w:rPr>
+        <w:t xml:space="preserve">S </w:t>
+      </w:r>
+      <w:r>
+        <w:rPr>
+          <w:b/>
+          <w:bCs/>
+        </w:rPr>
+        <w:t>1</w:t>
+      </w:r>
+      <w:r>
+        <w:rPr>
+          <w:b/>
+          <w:bCs/>
+        </w:rPr>
+        <w:t xml:space="preserve"> </w:t>
+      </w:r>
+      <w:r>
+        <w:rPr>
+          <w:b/>
+          <w:bCs/>
+        </w:rPr>
+        <w:t>(VIT) – VALIDAÇÃO DA ARQUITETURA</w:t>
       </w:r>
     </w:p>
     <w:p>
@@ -1819,7 +1847,6 @@
     <w:p>
       <w:pPr>
         <w:pStyle w:val="PargrafodaLista"/>
-        <w:jc w:val="both"/>
         <w:rPr>
           <w:b/>
           <w:bCs/>
@@ -1831,7 +1858,66 @@
         <w:pStyle w:val="PargrafodaLista"/>
         <w:numPr>
           <w:ilvl w:val="0"/>
-          <w:numId w:val="1"/>
+          <w:numId w:val="33"/>
+        </w:numPr>
+        <w:jc w:val="both"/>
+        <w:rPr>
+          <w:b/>
+          <w:bCs/>
+        </w:rPr>
+      </w:pPr>
+      <w:r>
+        <w:rPr>
+          <w:b/>
+          <w:bCs/>
+        </w:rPr>
+        <w:t xml:space="preserve">EXPERIMENTO </w:t>
+      </w:r>
+      <w:r>
+        <w:rPr>
+          <w:b/>
+          <w:bCs/>
+        </w:rPr>
+        <w:t>2</w:t>
+      </w:r>
+      <w:r>
+        <w:rPr>
+          <w:b/>
+          <w:bCs/>
+        </w:rPr>
+        <w:t xml:space="preserve"> – </w:t>
+      </w:r>
+      <w:r>
+        <w:rPr>
+          <w:b/>
+          <w:bCs/>
+        </w:rPr>
+        <w:t>??</w:t>
+      </w:r>
+      <w:r>
+        <w:rPr>
+          <w:b/>
+          <w:bCs/>
+        </w:rPr>
+        <w:t>:</w:t>
+      </w:r>
+    </w:p>
+    <w:p>
+      <w:pPr>
+        <w:pStyle w:val="PargrafodaLista"/>
+        <w:jc w:val="both"/>
+        <w:rPr>
+          <w:b/>
+          <w:bCs/>
+        </w:rPr>
+      </w:pPr>
+    </w:p>
+    <w:p>
+      <w:pPr>
+        <w:pStyle w:val="PargrafodaLista"/>
+        <w:numPr>
+          <w:ilvl w:val="0"/>
+          <w:numId w:val="33"/>
         </w:numPr>
         <w:jc w:val="both"/>
         <w:rPr>
@@ -2356,7 +2442,6 @@
           <w:sz w:val="18"/>
           <w:szCs w:val="18"/>
         </w:rPr>
-        <w:lastRenderedPageBreak/>
         <w:t xml:space="preserve">Figura </w:t>
       </w:r>
       <w:r>
@@ -2489,7 +2574,7 @@
         <w:pStyle w:val="PargrafodaLista"/>
         <w:numPr>
           <w:ilvl w:val="0"/>
-          <w:numId w:val="1"/>
+          <w:numId w:val="33"/>
         </w:numPr>
         <w:rPr>
           <w:b/>
@@ -3350,7 +3435,7 @@
         <v:path o:extrusionok="f" gradientshapeok="t" o:connecttype="rect"/>
         <o:lock v:ext="edit" aspectratio="t"/>
       </v:shapetype>
-      <v:shape id="_x0000_i1096" type="#_x0000_t75" style="width:693.1pt;height:487.1pt;visibility:visible;mso-wrap-style:square" o:bullet="t">
+      <v:shape id="_x0000_i1032" type="#_x0000_t75" style="width:693.1pt;height:487.1pt;visibility:visible;mso-wrap-style:square" o:bullet="t">
         <v:imagedata r:id="rId1" o:title="" croptop="19686f" cropbottom="43833f" cropleft="8606f" cropright="55951f"/>
       </v:shape>
     </w:pict>
@@ -5166,7 +5251,7 @@
   <w:abstractNum w:abstractNumId="16" w15:restartNumberingAfterBreak="0">
     <w:nsid w:val="2AFF2799"/>
     <w:multiLevelType w:val="hybridMultilevel"/>
-    <w:tmpl w:val="D56C3D22"/>
+    <w:tmpl w:val="AFA82D4E"/>
     <w:lvl w:ilvl="0" w:tplc="0416000F">
       <w:start w:val="1"/>
       <w:numFmt w:val="decimal"/>

</xml_diff>